<commit_message>
Added fullscreen page traversal
</commit_message>
<xml_diff>
--- a/user_manual.docx
+++ b/user_manual.docx
@@ -102,7 +102,27 @@
           <w:szCs w:val="52"/>
         </w:rPr>
         <w:br/>
-        <w:t>IT Administrator &amp; User Manual</w:t>
+        <w:t>IT Administrator</w:t>
+      </w:r>
+      <w:r>
+        <w:rPr>
+          <w:rFonts w:ascii="Futura" w:hAnsi="Futura"/>
+          <w:b/>
+          <w:bCs/>
+          <w:sz w:val="52"/>
+          <w:szCs w:val="52"/>
+        </w:rPr>
+        <w:t xml:space="preserve"> </w:t>
+      </w:r>
+      <w:r>
+        <w:rPr>
+          <w:rFonts w:ascii="Futura" w:hAnsi="Futura"/>
+          <w:b/>
+          <w:bCs/>
+          <w:sz w:val="52"/>
+          <w:szCs w:val="52"/>
+        </w:rPr>
+        <w:t>Manual</w:t>
       </w:r>
     </w:p>
     <w:p>
@@ -341,7 +361,7 @@
         <w:rPr>
           <w:rFonts w:ascii="Futura" w:hAnsi="Futura"/>
         </w:rPr>
-        <w:t xml:space="preserve"> for Hayakawa Electronics (PHILS.) Corp. It provides real-time visibility into infrastructure health, tracking latency (</w:t>
+        <w:t xml:space="preserve"> for Hayakawa Electronics (PHILS.) Corp. It provides real-time visibility into tracking latency (</w:t>
       </w:r>
       <w:proofErr w:type="spellStart"/>
       <w:r>
@@ -560,14 +580,130 @@
         <w:rPr>
           <w:rFonts w:ascii="Futura" w:hAnsi="Futura"/>
         </w:rPr>
-        <w:t>* Open your browser and navigate to the local address (e.g., localhost/HEPC-</w:t>
+        <w:t xml:space="preserve">* Open your browser and navigate to the </w:t>
+      </w:r>
+      <w:r>
+        <w:rPr>
+          <w:rFonts w:ascii="Futura" w:hAnsi="Futura"/>
+        </w:rPr>
+        <w:t xml:space="preserve">system </w:t>
       </w:r>
       <w:proofErr w:type="spellStart"/>
       <w:r>
         <w:rPr>
           <w:rFonts w:ascii="Futura" w:hAnsi="Futura"/>
         </w:rPr>
+        <w:t>url</w:t>
+      </w:r>
+      <w:proofErr w:type="spellEnd"/>
+      <w:r>
+        <w:rPr>
+          <w:rFonts w:ascii="Futura" w:hAnsi="Futura"/>
+        </w:rPr>
+        <w:t xml:space="preserve"> (e.g., </w:t>
+      </w:r>
+      <w:r>
+        <w:rPr>
+          <w:rFonts w:ascii="Futura" w:hAnsi="Futura"/>
+          <w:i/>
+          <w:iCs/>
+        </w:rPr>
+        <w:t>localhost/HEPC-</w:t>
+      </w:r>
+      <w:proofErr w:type="spellStart"/>
+      <w:r>
+        <w:rPr>
+          <w:rFonts w:ascii="Futura" w:hAnsi="Futura"/>
+          <w:i/>
+          <w:iCs/>
+        </w:rPr>
         <w:t>NetPulse</w:t>
+      </w:r>
+      <w:proofErr w:type="spellEnd"/>
+      <w:r>
+        <w:rPr>
+          <w:rFonts w:ascii="Futura" w:hAnsi="Futura"/>
+          <w:i/>
+          <w:iCs/>
+        </w:rPr>
+        <w:t xml:space="preserve">/ </w:t>
+      </w:r>
+      <w:proofErr w:type="spellStart"/>
+      <w:r>
+        <w:rPr>
+          <w:rFonts w:ascii="Futura" w:hAnsi="Futura"/>
+          <w:i/>
+          <w:iCs/>
+        </w:rPr>
+        <w:t>logIn.php</w:t>
+      </w:r>
+      <w:proofErr w:type="spellEnd"/>
+      <w:r>
+        <w:rPr>
+          <w:rFonts w:ascii="Futura" w:hAnsi="Futura"/>
+          <w:i/>
+          <w:iCs/>
+        </w:rPr>
+        <w:t xml:space="preserve"> </w:t>
+      </w:r>
+      <w:r>
+        <w:rPr>
+          <w:rFonts w:ascii="Futura" w:hAnsi="Futura"/>
+        </w:rPr>
+        <w:t xml:space="preserve">or </w:t>
+      </w:r>
+      <w:r>
+        <w:rPr>
+          <w:rFonts w:ascii="Futura" w:hAnsi="Futura"/>
+          <w:i/>
+          <w:iCs/>
+        </w:rPr>
+        <w:t>&lt;server-</w:t>
+      </w:r>
+      <w:proofErr w:type="spellStart"/>
+      <w:r>
+        <w:rPr>
+          <w:rFonts w:ascii="Futura" w:hAnsi="Futura"/>
+          <w:i/>
+          <w:iCs/>
+        </w:rPr>
+        <w:t>ip</w:t>
+      </w:r>
+      <w:proofErr w:type="spellEnd"/>
+      <w:r>
+        <w:rPr>
+          <w:rFonts w:ascii="Futura" w:hAnsi="Futura"/>
+          <w:i/>
+          <w:iCs/>
+        </w:rPr>
+        <w:t>&gt;/HEPC-</w:t>
+      </w:r>
+      <w:proofErr w:type="spellStart"/>
+      <w:r>
+        <w:rPr>
+          <w:rFonts w:ascii="Futura" w:hAnsi="Futura"/>
+          <w:i/>
+          <w:iCs/>
+        </w:rPr>
+        <w:t>NetPulse</w:t>
+      </w:r>
+      <w:proofErr w:type="spellEnd"/>
+      <w:r>
+        <w:rPr>
+          <w:rFonts w:ascii="Futura" w:hAnsi="Futura"/>
+          <w:i/>
+          <w:iCs/>
+        </w:rPr>
+        <w:t>/</w:t>
+      </w:r>
+      <w:proofErr w:type="spellStart"/>
+      <w:r>
+        <w:rPr>
+          <w:rFonts w:ascii="Futura" w:hAnsi="Futura"/>
+          <w:i/>
+          <w:iCs/>
+        </w:rPr>
+        <w:t>logIn.php</w:t>
       </w:r>
       <w:proofErr w:type="spellEnd"/>
       <w:r>
@@ -732,6 +868,7 @@
         <w:rPr>
           <w:rFonts w:ascii="Futura" w:hAnsi="Futura"/>
         </w:rPr>
+        <w:lastRenderedPageBreak/>
         <w:pict w14:anchorId="37BE963A">
           <v:rect id="_x0000_i1028" style="width:0;height:1.5pt" o:hralign="center" o:hrstd="t" o:hr="t" fillcolor="#a0a0a0" stroked="f"/>
         </w:pict>
@@ -1239,6 +1376,7 @@
         <w:rPr>
           <w:rFonts w:ascii="Futura" w:hAnsi="Futura"/>
         </w:rPr>
+        <w:lastRenderedPageBreak/>
         <w:pict w14:anchorId="5536555E">
           <v:rect id="_x0000_i1031" style="width:0;height:1.5pt" o:hralign="center" o:hrstd="t" o:hr="t" fillcolor="#a0a0a0" stroked="f"/>
         </w:pict>

</xml_diff>

<commit_message>
Minor tweaks and revisions
</commit_message>
<xml_diff>
--- a/user_manual.docx
+++ b/user_manual.docx
@@ -122,6 +122,16 @@
           <w:sz w:val="52"/>
           <w:szCs w:val="52"/>
         </w:rPr>
+        <w:t xml:space="preserve">&amp; User </w:t>
+      </w:r>
+      <w:r>
+        <w:rPr>
+          <w:rFonts w:ascii="Futura" w:hAnsi="Futura"/>
+          <w:b/>
+          <w:bCs/>
+          <w:sz w:val="52"/>
+          <w:szCs w:val="52"/>
+        </w:rPr>
         <w:t>Manual</w:t>
       </w:r>
     </w:p>
@@ -391,6 +401,39 @@
         </w:rPr>
         <w:pict w14:anchorId="7BCDE0EC">
           <v:rect id="_x0000_i1026" style="width:0;height:1.5pt" o:hralign="center" o:hrstd="t" o:hr="t" fillcolor="#a0a0a0" stroked="f"/>
+        </w:pict>
+      </w:r>
+    </w:p>
+    <w:p>
+      <w:pPr>
+        <w:jc w:val="both"/>
+        <w:rPr>
+          <w:rFonts w:ascii="Futura" w:hAnsi="Futura"/>
+        </w:rPr>
+      </w:pPr>
+    </w:p>
+    <w:p>
+      <w:pPr>
+        <w:jc w:val="both"/>
+        <w:rPr>
+          <w:rFonts w:ascii="Futura" w:hAnsi="Futura"/>
+        </w:rPr>
+      </w:pPr>
+    </w:p>
+    <w:p>
+      <w:pPr>
+        <w:jc w:val="both"/>
+        <w:rPr>
+          <w:rFonts w:ascii="Futura" w:hAnsi="Futura"/>
+        </w:rPr>
+      </w:pPr>
+      <w:r>
+        <w:rPr>
+          <w:rFonts w:ascii="Futura" w:hAnsi="Futura"/>
+        </w:rPr>
+        <w:lastRenderedPageBreak/>
+        <w:pict w14:anchorId="6E33332C">
+          <v:rect id="_x0000_i1036" style="width:0;height:1.5pt" o:hralign="center" o:hrstd="t" o:hr="t" fillcolor="#a0a0a0" stroked="f"/>
         </w:pict>
       </w:r>
     </w:p>
@@ -525,7 +568,19 @@
         <w:rPr>
           <w:rFonts w:ascii="Futura" w:hAnsi="Futura"/>
         </w:rPr>
-        <w:t xml:space="preserve"> Copy the repository folder into the </w:t>
+        <w:t xml:space="preserve"> Copy the </w:t>
+      </w:r>
+      <w:r>
+        <w:rPr>
+          <w:rFonts w:ascii="Futura" w:hAnsi="Futura"/>
+        </w:rPr>
+        <w:t>project</w:t>
+      </w:r>
+      <w:r>
+        <w:rPr>
+          <w:rFonts w:ascii="Futura" w:hAnsi="Futura"/>
+        </w:rPr>
+        <w:t xml:space="preserve"> folder into the </w:t>
       </w:r>
       <w:proofErr w:type="spellStart"/>
       <w:r>
@@ -605,24 +660,40 @@
       <w:r>
         <w:rPr>
           <w:rFonts w:ascii="Futura" w:hAnsi="Futura"/>
-          <w:i/>
-          <w:iCs/>
-        </w:rPr>
-        <w:t>localhost/HEPC-</w:t>
+          <w:b/>
+          <w:bCs/>
+          <w:i/>
+          <w:iCs/>
+        </w:rPr>
+        <w:t>localhost</w:t>
+      </w:r>
+      <w:r>
+        <w:rPr>
+          <w:rFonts w:ascii="Futura" w:hAnsi="Futura"/>
+          <w:b/>
+          <w:bCs/>
+          <w:i/>
+          <w:iCs/>
+        </w:rPr>
+        <w:t>/</w:t>
       </w:r>
       <w:proofErr w:type="spellStart"/>
       <w:r>
         <w:rPr>
           <w:rFonts w:ascii="Futura" w:hAnsi="Futura"/>
-          <w:i/>
-          <w:iCs/>
-        </w:rPr>
-        <w:t>NetPulse</w:t>
+          <w:b/>
+          <w:bCs/>
+          <w:i/>
+          <w:iCs/>
+        </w:rPr>
+        <w:t>net_pulse</w:t>
       </w:r>
       <w:proofErr w:type="spellEnd"/>
       <w:r>
         <w:rPr>
           <w:rFonts w:ascii="Futura" w:hAnsi="Futura"/>
+          <w:b/>
+          <w:bCs/>
           <w:i/>
           <w:iCs/>
         </w:rPr>
@@ -632,6 +703,8 @@
       <w:r>
         <w:rPr>
           <w:rFonts w:ascii="Futura" w:hAnsi="Futura"/>
+          <w:b/>
+          <w:bCs/>
           <w:i/>
           <w:iCs/>
         </w:rPr>
@@ -655,6 +728,8 @@
       <w:r>
         <w:rPr>
           <w:rFonts w:ascii="Futura" w:hAnsi="Futura"/>
+          <w:b/>
+          <w:bCs/>
           <w:i/>
           <w:iCs/>
         </w:rPr>
@@ -664,6 +739,8 @@
       <w:r>
         <w:rPr>
           <w:rFonts w:ascii="Futura" w:hAnsi="Futura"/>
+          <w:b/>
+          <w:bCs/>
           <w:i/>
           <w:iCs/>
         </w:rPr>
@@ -673,24 +750,50 @@
       <w:r>
         <w:rPr>
           <w:rFonts w:ascii="Futura" w:hAnsi="Futura"/>
-          <w:i/>
-          <w:iCs/>
-        </w:rPr>
-        <w:t>&gt;/HEPC-</w:t>
+          <w:b/>
+          <w:bCs/>
+          <w:i/>
+          <w:iCs/>
+        </w:rPr>
+        <w:t>&gt;/</w:t>
+      </w:r>
+      <w:r>
+        <w:rPr>
+          <w:rFonts w:ascii="Futura" w:hAnsi="Futura"/>
+          <w:b/>
+          <w:bCs/>
+          <w:i/>
+          <w:iCs/>
+        </w:rPr>
+        <w:t xml:space="preserve"> </w:t>
       </w:r>
       <w:proofErr w:type="spellStart"/>
       <w:r>
         <w:rPr>
           <w:rFonts w:ascii="Futura" w:hAnsi="Futura"/>
-          <w:i/>
-          <w:iCs/>
-        </w:rPr>
-        <w:t>NetPulse</w:t>
+          <w:b/>
+          <w:bCs/>
+          <w:i/>
+          <w:iCs/>
+        </w:rPr>
+        <w:t>net_pulse</w:t>
       </w:r>
       <w:proofErr w:type="spellEnd"/>
       <w:r>
         <w:rPr>
           <w:rFonts w:ascii="Futura" w:hAnsi="Futura"/>
+          <w:b/>
+          <w:bCs/>
+          <w:i/>
+          <w:iCs/>
+        </w:rPr>
+        <w:t xml:space="preserve"> </w:t>
+      </w:r>
+      <w:r>
+        <w:rPr>
+          <w:rFonts w:ascii="Futura" w:hAnsi="Futura"/>
+          <w:b/>
+          <w:bCs/>
           <w:i/>
           <w:iCs/>
         </w:rPr>
@@ -700,6 +803,8 @@
       <w:r>
         <w:rPr>
           <w:rFonts w:ascii="Futura" w:hAnsi="Futura"/>
+          <w:b/>
+          <w:bCs/>
           <w:i/>
           <w:iCs/>
         </w:rPr>
@@ -709,6 +814,8 @@
       <w:r>
         <w:rPr>
           <w:rFonts w:ascii="Futura" w:hAnsi="Futura"/>
+          <w:b/>
+          <w:bCs/>
         </w:rPr>
         <w:t>).</w:t>
       </w:r>
@@ -800,6 +907,10 @@
       <w:r>
         <w:rPr>
           <w:rFonts w:ascii="Futura" w:hAnsi="Futura"/>
+          <w:b/>
+          <w:bCs/>
+          <w:i/>
+          <w:iCs/>
         </w:rPr>
         <w:t>dbConfig.php</w:t>
       </w:r>
@@ -816,6 +927,8 @@
         <w:jc w:val="both"/>
         <w:rPr>
           <w:rFonts w:ascii="Futura" w:hAnsi="Futura"/>
+          <w:b/>
+          <w:bCs/>
         </w:rPr>
       </w:pPr>
       <w:r>
@@ -834,53 +947,6 @@
           <w:rFonts w:ascii="Futura" w:hAnsi="Futura"/>
           <w:b/>
           <w:bCs/>
-        </w:rPr>
-      </w:pPr>
-    </w:p>
-    <w:p>
-      <w:pPr>
-        <w:jc w:val="both"/>
-        <w:rPr>
-          <w:rFonts w:ascii="Futura" w:hAnsi="Futura"/>
-          <w:b/>
-          <w:bCs/>
-        </w:rPr>
-      </w:pPr>
-    </w:p>
-    <w:p>
-      <w:pPr>
-        <w:jc w:val="both"/>
-        <w:rPr>
-          <w:rFonts w:ascii="Futura" w:hAnsi="Futura"/>
-        </w:rPr>
-      </w:pPr>
-    </w:p>
-    <w:p>
-      <w:pPr>
-        <w:jc w:val="both"/>
-        <w:rPr>
-          <w:rFonts w:ascii="Futura" w:hAnsi="Futura"/>
-          <w:b/>
-          <w:bCs/>
-        </w:rPr>
-      </w:pPr>
-      <w:r>
-        <w:rPr>
-          <w:rFonts w:ascii="Futura" w:hAnsi="Futura"/>
-        </w:rPr>
-        <w:lastRenderedPageBreak/>
-        <w:pict w14:anchorId="37BE963A">
-          <v:rect id="_x0000_i1028" style="width:0;height:1.5pt" o:hralign="center" o:hrstd="t" o:hr="t" fillcolor="#a0a0a0" stroked="f"/>
-        </w:pict>
-      </w:r>
-    </w:p>
-    <w:p>
-      <w:pPr>
-        <w:jc w:val="both"/>
-        <w:rPr>
-          <w:rFonts w:ascii="Futura" w:hAnsi="Futura"/>
-          <w:b/>
-          <w:bCs/>
           <w:sz w:val="32"/>
           <w:szCs w:val="40"/>
         </w:rPr>
@@ -908,6 +974,72 @@
           <w:rFonts w:ascii="Futura" w:hAnsi="Futura"/>
         </w:rPr>
         <w:t>Once the auto-initialization is complete, you can log in immediately.</w:t>
+      </w:r>
+    </w:p>
+    <w:p>
+      <w:pPr>
+        <w:jc w:val="center"/>
+        <w:rPr>
+          <w:rFonts w:ascii="Futura" w:hAnsi="Futura"/>
+          <w:i/>
+          <w:iCs/>
+        </w:rPr>
+      </w:pPr>
+      <w:r>
+        <w:rPr>
+          <w:rFonts w:ascii="Futura" w:hAnsi="Futura"/>
+        </w:rPr>
+        <w:drawing>
+          <wp:inline distT="0" distB="0" distL="0" distR="0" wp14:anchorId="326F6A61" wp14:editId="18BF830C">
+            <wp:extent cx="5943600" cy="3341370"/>
+            <wp:effectExtent l="0" t="0" r="0" b="0"/>
+            <wp:docPr id="932806296" name="Picture 1"/>
+            <wp:cNvGraphicFramePr>
+              <a:graphicFrameLocks xmlns:a="http://schemas.openxmlformats.org/drawingml/2006/main" noChangeAspect="1"/>
+            </wp:cNvGraphicFramePr>
+            <a:graphic xmlns:a="http://schemas.openxmlformats.org/drawingml/2006/main">
+              <a:graphicData uri="http://schemas.openxmlformats.org/drawingml/2006/picture">
+                <pic:pic xmlns:pic="http://schemas.openxmlformats.org/drawingml/2006/picture">
+                  <pic:nvPicPr>
+                    <pic:cNvPr id="932806296" name=""/>
+                    <pic:cNvPicPr/>
+                  </pic:nvPicPr>
+                  <pic:blipFill>
+                    <a:blip r:embed="rId7"/>
+                    <a:stretch>
+                      <a:fillRect/>
+                    </a:stretch>
+                  </pic:blipFill>
+                  <pic:spPr>
+                    <a:xfrm>
+                      <a:off x="0" y="0"/>
+                      <a:ext cx="5943600" cy="3341370"/>
+                    </a:xfrm>
+                    <a:prstGeom prst="rect">
+                      <a:avLst/>
+                    </a:prstGeom>
+                  </pic:spPr>
+                </pic:pic>
+              </a:graphicData>
+            </a:graphic>
+          </wp:inline>
+        </w:drawing>
+      </w:r>
+      <w:r>
+        <w:rPr>
+          <w:rFonts w:ascii="Futura" w:hAnsi="Futura"/>
+        </w:rPr>
+        <w:br/>
+      </w:r>
+      <w:r>
+        <w:rPr>
+          <w:rFonts w:ascii="Futura" w:hAnsi="Futura"/>
+          <w:i/>
+          <w:iCs/>
+          <w:sz w:val="20"/>
+          <w:szCs w:val="20"/>
+        </w:rPr>
+        <w:t>Net Pulse Login Page</w:t>
       </w:r>
     </w:p>
     <w:p>
@@ -1010,6 +1142,49 @@
         <w:jc w:val="both"/>
         <w:rPr>
           <w:rFonts w:ascii="Futura" w:hAnsi="Futura"/>
+        </w:rPr>
+      </w:pPr>
+    </w:p>
+    <w:p>
+      <w:pPr>
+        <w:jc w:val="both"/>
+        <w:rPr>
+          <w:rFonts w:ascii="Futura" w:hAnsi="Futura"/>
+        </w:rPr>
+      </w:pPr>
+      <w:r>
+        <w:rPr>
+          <w:rFonts w:ascii="Futura" w:hAnsi="Futura"/>
+          <w:i/>
+          <w:iCs/>
+        </w:rPr>
+        <w:t xml:space="preserve">(Note: You can change password directly in phpMyAdmin, just replace current password with a </w:t>
+      </w:r>
+      <w:proofErr w:type="spellStart"/>
+      <w:r>
+        <w:rPr>
+          <w:rFonts w:ascii="Futura" w:hAnsi="Futura"/>
+          <w:i/>
+          <w:iCs/>
+        </w:rPr>
+        <w:t>password_hashed</w:t>
+      </w:r>
+      <w:proofErr w:type="spellEnd"/>
+      <w:r>
+        <w:rPr>
+          <w:rFonts w:ascii="Futura" w:hAnsi="Futura"/>
+          <w:i/>
+          <w:iCs/>
+        </w:rPr>
+        <w:t xml:space="preserve"> version of your new password.)</w:t>
+      </w:r>
+    </w:p>
+    <w:p>
+      <w:pPr>
+        <w:ind w:firstLine="720"/>
+        <w:jc w:val="both"/>
+        <w:rPr>
+          <w:rFonts w:ascii="Futura" w:hAnsi="Futura"/>
           <w:sz w:val="16"/>
           <w:szCs w:val="16"/>
         </w:rPr>
@@ -1126,47 +1301,103 @@
         <w:rPr>
           <w:rFonts w:ascii="Futura" w:hAnsi="Futura"/>
         </w:rPr>
-        <w:t xml:space="preserve">Insert a new record with the desired username and a </w:t>
+        <w:t xml:space="preserve">Click on the </w:t>
+      </w:r>
+      <w:r>
+        <w:rPr>
+          <w:rFonts w:ascii="Futura" w:hAnsi="Futura"/>
+          <w:b/>
+          <w:bCs/>
+        </w:rPr>
+        <w:t>Insert</w:t>
+      </w:r>
+      <w:r>
+        <w:rPr>
+          <w:rFonts w:ascii="Futura" w:hAnsi="Futura"/>
+        </w:rPr>
+        <w:t xml:space="preserve"> tab.</w:t>
+      </w:r>
+    </w:p>
+    <w:p>
+      <w:pPr>
+        <w:numPr>
+          <w:ilvl w:val="0"/>
+          <w:numId w:val="3"/>
+        </w:numPr>
+        <w:jc w:val="both"/>
+        <w:rPr>
+          <w:rFonts w:ascii="Futura" w:hAnsi="Futura"/>
+        </w:rPr>
+      </w:pPr>
+      <w:r>
+        <w:rPr>
+          <w:rFonts w:ascii="Futura" w:hAnsi="Futura"/>
+        </w:rPr>
+        <w:t xml:space="preserve">Fill in values for username and password (only insert a </w:t>
       </w:r>
       <w:proofErr w:type="spellStart"/>
       <w:r>
         <w:rPr>
           <w:rFonts w:ascii="Futura" w:hAnsi="Futura"/>
-          <w:b/>
-          <w:bCs/>
-        </w:rPr>
-        <w:t>p</w:t>
-      </w:r>
-      <w:r>
-        <w:rPr>
-          <w:rFonts w:ascii="Futura" w:hAnsi="Futura"/>
-          <w:b/>
-          <w:bCs/>
-        </w:rPr>
-        <w:t>hp</w:t>
+        </w:rPr>
+        <w:t>php</w:t>
       </w:r>
       <w:proofErr w:type="spellEnd"/>
       <w:r>
         <w:rPr>
           <w:rFonts w:ascii="Futura" w:hAnsi="Futura"/>
-          <w:b/>
-          <w:bCs/>
-        </w:rPr>
-        <w:t xml:space="preserve"> </w:t>
-      </w:r>
-      <w:r>
-        <w:rPr>
-          <w:rFonts w:ascii="Futura" w:hAnsi="Futura"/>
-          <w:b/>
-          <w:bCs/>
-        </w:rPr>
-        <w:t>hashed</w:t>
-      </w:r>
-      <w:r>
-        <w:rPr>
-          <w:rFonts w:ascii="Futura" w:hAnsi="Futura"/>
-        </w:rPr>
-        <w:t xml:space="preserve"> version of the password.</w:t>
+        </w:rPr>
+        <w:t xml:space="preserve"> hashed version of the password otherwise log in will fail).</w:t>
+      </w:r>
+    </w:p>
+    <w:p>
+      <w:pPr>
+        <w:numPr>
+          <w:ilvl w:val="0"/>
+          <w:numId w:val="3"/>
+        </w:numPr>
+        <w:jc w:val="both"/>
+        <w:rPr>
+          <w:rFonts w:ascii="Futura" w:hAnsi="Futura"/>
+        </w:rPr>
+      </w:pPr>
+      <w:r>
+        <w:rPr>
+          <w:rFonts w:ascii="Futura" w:hAnsi="Futura"/>
+        </w:rPr>
+        <w:t xml:space="preserve">Leave the </w:t>
+      </w:r>
+      <w:proofErr w:type="spellStart"/>
+      <w:r>
+        <w:rPr>
+          <w:rFonts w:ascii="Futura" w:hAnsi="Futura"/>
+        </w:rPr>
+        <w:t>user_id</w:t>
+      </w:r>
+      <w:proofErr w:type="spellEnd"/>
+      <w:r>
+        <w:rPr>
+          <w:rFonts w:ascii="Futura" w:hAnsi="Futura"/>
+        </w:rPr>
+        <w:t xml:space="preserve"> and ping blank.</w:t>
+      </w:r>
+    </w:p>
+    <w:p>
+      <w:pPr>
+        <w:numPr>
+          <w:ilvl w:val="0"/>
+          <w:numId w:val="3"/>
+        </w:numPr>
+        <w:jc w:val="both"/>
+        <w:rPr>
+          <w:rFonts w:ascii="Futura" w:hAnsi="Futura"/>
+        </w:rPr>
+      </w:pPr>
+      <w:r>
+        <w:rPr>
+          <w:rFonts w:ascii="Futura" w:hAnsi="Futura"/>
+        </w:rPr>
+        <w:t>Click Go. A new account has been registered and can be used for login.</w:t>
       </w:r>
     </w:p>
     <w:p>
@@ -1233,11 +1464,581 @@
     </w:p>
     <w:p>
       <w:pPr>
+        <w:jc w:val="center"/>
+        <w:rPr>
+          <w:rFonts w:ascii="Futura" w:hAnsi="Futura"/>
+          <w:i/>
+          <w:iCs/>
+          <w:sz w:val="20"/>
+          <w:szCs w:val="20"/>
+        </w:rPr>
+      </w:pPr>
+      <w:r>
+        <w:rPr>
+          <w:rFonts w:ascii="Futura" w:hAnsi="Futura"/>
+        </w:rPr>
+        <w:drawing>
+          <wp:inline distT="0" distB="0" distL="0" distR="0" wp14:anchorId="52B0E5AA" wp14:editId="77675CE9">
+            <wp:extent cx="5193419" cy="2919633"/>
+            <wp:effectExtent l="0" t="0" r="7620" b="0"/>
+            <wp:docPr id="2132783825" name="Picture 1"/>
+            <wp:cNvGraphicFramePr>
+              <a:graphicFrameLocks xmlns:a="http://schemas.openxmlformats.org/drawingml/2006/main" noChangeAspect="1"/>
+            </wp:cNvGraphicFramePr>
+            <a:graphic xmlns:a="http://schemas.openxmlformats.org/drawingml/2006/main">
+              <a:graphicData uri="http://schemas.openxmlformats.org/drawingml/2006/picture">
+                <pic:pic xmlns:pic="http://schemas.openxmlformats.org/drawingml/2006/picture">
+                  <pic:nvPicPr>
+                    <pic:cNvPr id="2132783825" name=""/>
+                    <pic:cNvPicPr/>
+                  </pic:nvPicPr>
+                  <pic:blipFill>
+                    <a:blip r:embed="rId8" cstate="print">
+                      <a:extLst>
+                        <a:ext uri="{28A0092B-C50C-407E-A947-70E740481C1C}">
+                          <a14:useLocalDpi xmlns:a14="http://schemas.microsoft.com/office/drawing/2010/main" val="0"/>
+                        </a:ext>
+                      </a:extLst>
+                    </a:blip>
+                    <a:stretch>
+                      <a:fillRect/>
+                    </a:stretch>
+                  </pic:blipFill>
+                  <pic:spPr>
+                    <a:xfrm>
+                      <a:off x="0" y="0"/>
+                      <a:ext cx="5193419" cy="2919633"/>
+                    </a:xfrm>
+                    <a:prstGeom prst="rect">
+                      <a:avLst/>
+                    </a:prstGeom>
+                  </pic:spPr>
+                </pic:pic>
+              </a:graphicData>
+            </a:graphic>
+          </wp:inline>
+        </w:drawing>
+      </w:r>
+      <w:r>
+        <w:rPr>
+          <w:rFonts w:ascii="Futura" w:hAnsi="Futura"/>
+        </w:rPr>
+        <w:br/>
+      </w:r>
+      <w:r>
+        <w:rPr>
+          <w:rFonts w:ascii="Futura" w:hAnsi="Futura"/>
+          <w:i/>
+          <w:iCs/>
+          <w:sz w:val="20"/>
+          <w:szCs w:val="20"/>
+        </w:rPr>
+        <w:t>Latency charts in Dashboard</w:t>
+      </w:r>
+    </w:p>
+    <w:p>
+      <w:pPr>
+        <w:jc w:val="center"/>
+        <w:rPr>
+          <w:rFonts w:ascii="Futura" w:hAnsi="Futura"/>
+          <w:i/>
+          <w:iCs/>
+          <w:sz w:val="20"/>
+          <w:szCs w:val="20"/>
+        </w:rPr>
+      </w:pPr>
+    </w:p>
+    <w:p>
+      <w:pPr>
+        <w:jc w:val="center"/>
+        <w:rPr>
+          <w:rFonts w:ascii="Futura" w:hAnsi="Futura"/>
+          <w:i/>
+          <w:iCs/>
+          <w:sz w:val="20"/>
+          <w:szCs w:val="20"/>
+        </w:rPr>
+      </w:pPr>
+    </w:p>
+    <w:p>
+      <w:pPr>
+        <w:jc w:val="center"/>
+        <w:rPr>
+          <w:rFonts w:ascii="Futura" w:hAnsi="Futura"/>
+          <w:i/>
+          <w:iCs/>
+          <w:sz w:val="20"/>
+          <w:szCs w:val="20"/>
+        </w:rPr>
+      </w:pPr>
+    </w:p>
+    <w:p>
+      <w:pPr>
+        <w:jc w:val="center"/>
+        <w:rPr>
+          <w:rFonts w:ascii="Futura" w:hAnsi="Futura"/>
+          <w:i/>
+          <w:iCs/>
+          <w:sz w:val="20"/>
+          <w:szCs w:val="20"/>
+        </w:rPr>
+      </w:pPr>
+    </w:p>
+    <w:p>
+      <w:pPr>
+        <w:jc w:val="center"/>
+        <w:rPr>
+          <w:rFonts w:ascii="Futura" w:hAnsi="Futura"/>
+          <w:i/>
+          <w:iCs/>
+          <w:sz w:val="20"/>
+          <w:szCs w:val="20"/>
+        </w:rPr>
+      </w:pPr>
+    </w:p>
+    <w:p>
+      <w:pPr>
+        <w:jc w:val="center"/>
+        <w:rPr>
+          <w:rFonts w:ascii="Futura" w:hAnsi="Futura"/>
+          <w:i/>
+          <w:iCs/>
+          <w:sz w:val="20"/>
+          <w:szCs w:val="20"/>
+        </w:rPr>
+      </w:pPr>
+    </w:p>
+    <w:p>
+      <w:pPr>
+        <w:jc w:val="center"/>
+        <w:rPr>
+          <w:rFonts w:ascii="Futura" w:hAnsi="Futura"/>
+          <w:i/>
+          <w:iCs/>
+          <w:sz w:val="20"/>
+          <w:szCs w:val="20"/>
+        </w:rPr>
+      </w:pPr>
+    </w:p>
+    <w:p>
+      <w:pPr>
+        <w:pStyle w:val="ListParagraph"/>
+        <w:numPr>
+          <w:ilvl w:val="0"/>
+          <w:numId w:val="7"/>
+        </w:numPr>
+        <w:rPr>
+          <w:rFonts w:ascii="Futura" w:hAnsi="Futura"/>
+          <w:sz w:val="20"/>
+          <w:szCs w:val="20"/>
+        </w:rPr>
+      </w:pPr>
+      <w:r>
+        <w:rPr>
+          <w:rFonts w:ascii="Futura" w:hAnsi="Futura"/>
+          <w:b/>
+          <w:bCs/>
+        </w:rPr>
+        <w:lastRenderedPageBreak/>
+        <w:t>Network Monitoring Pages:</w:t>
+      </w:r>
+      <w:r>
+        <w:rPr>
+          <w:rFonts w:ascii="Futura" w:hAnsi="Futura"/>
+        </w:rPr>
+        <w:t xml:space="preserve"> </w:t>
+      </w:r>
+      <w:r>
+        <w:rPr>
+          <w:rFonts w:ascii="Futura" w:hAnsi="Futura"/>
+        </w:rPr>
+        <w:t>Illustrates network health of the corresponding devices or addresses of that web page:</w:t>
+      </w:r>
+    </w:p>
+    <w:p>
+      <w:pPr>
+        <w:jc w:val="center"/>
+        <w:rPr>
+          <w:rFonts w:ascii="Futura" w:hAnsi="Futura"/>
+          <w:i/>
+          <w:iCs/>
+          <w:sz w:val="20"/>
+          <w:szCs w:val="20"/>
+        </w:rPr>
+      </w:pPr>
+      <w:r>
+        <w:rPr>
+          <w:rFonts w:ascii="Futura" w:hAnsi="Futura"/>
+          <w:sz w:val="20"/>
+          <w:szCs w:val="20"/>
+        </w:rPr>
+        <w:drawing>
+          <wp:inline distT="0" distB="0" distL="0" distR="0" wp14:anchorId="1981C9D1" wp14:editId="293852B9">
+            <wp:extent cx="5943600" cy="3341370"/>
+            <wp:effectExtent l="0" t="0" r="0" b="0"/>
+            <wp:docPr id="1794863292" name="Picture 1"/>
+            <wp:cNvGraphicFramePr>
+              <a:graphicFrameLocks xmlns:a="http://schemas.openxmlformats.org/drawingml/2006/main" noChangeAspect="1"/>
+            </wp:cNvGraphicFramePr>
+            <a:graphic xmlns:a="http://schemas.openxmlformats.org/drawingml/2006/main">
+              <a:graphicData uri="http://schemas.openxmlformats.org/drawingml/2006/picture">
+                <pic:pic xmlns:pic="http://schemas.openxmlformats.org/drawingml/2006/picture">
+                  <pic:nvPicPr>
+                    <pic:cNvPr id="1794863292" name=""/>
+                    <pic:cNvPicPr/>
+                  </pic:nvPicPr>
+                  <pic:blipFill>
+                    <a:blip r:embed="rId9"/>
+                    <a:stretch>
+                      <a:fillRect/>
+                    </a:stretch>
+                  </pic:blipFill>
+                  <pic:spPr>
+                    <a:xfrm>
+                      <a:off x="0" y="0"/>
+                      <a:ext cx="5943600" cy="3341370"/>
+                    </a:xfrm>
+                    <a:prstGeom prst="rect">
+                      <a:avLst/>
+                    </a:prstGeom>
+                  </pic:spPr>
+                </pic:pic>
+              </a:graphicData>
+            </a:graphic>
+          </wp:inline>
+        </w:drawing>
+      </w:r>
+      <w:r>
+        <w:rPr>
+          <w:rFonts w:ascii="Futura" w:hAnsi="Futura"/>
+          <w:i/>
+          <w:iCs/>
+          <w:sz w:val="20"/>
+          <w:szCs w:val="20"/>
+        </w:rPr>
+        <w:t xml:space="preserve">IP Addresses Web Page displaying server and switch </w:t>
+      </w:r>
+      <w:proofErr w:type="spellStart"/>
+      <w:r>
+        <w:rPr>
+          <w:rFonts w:ascii="Futura" w:hAnsi="Futura"/>
+          <w:i/>
+          <w:iCs/>
+          <w:sz w:val="20"/>
+          <w:szCs w:val="20"/>
+        </w:rPr>
+        <w:t>ips</w:t>
+      </w:r>
+      <w:proofErr w:type="spellEnd"/>
+      <w:r>
+        <w:rPr>
+          <w:rFonts w:ascii="Futura" w:hAnsi="Futura"/>
+          <w:i/>
+          <w:iCs/>
+          <w:sz w:val="20"/>
+          <w:szCs w:val="20"/>
+        </w:rPr>
+        <w:br/>
+      </w:r>
+      <w:r>
+        <w:rPr>
+          <w:rFonts w:ascii="Futura" w:hAnsi="Futura"/>
+          <w:i/>
+          <w:iCs/>
+          <w:sz w:val="20"/>
+          <w:szCs w:val="20"/>
+        </w:rPr>
+        <w:br/>
+      </w:r>
+      <w:r>
+        <w:rPr>
+          <w:rFonts w:ascii="Futura" w:hAnsi="Futura"/>
+          <w:i/>
+          <w:iCs/>
+          <w:sz w:val="20"/>
+          <w:szCs w:val="20"/>
+        </w:rPr>
+        <w:drawing>
+          <wp:inline distT="0" distB="0" distL="0" distR="0" wp14:anchorId="49C41F66" wp14:editId="2BE4DEDE">
+            <wp:extent cx="5943600" cy="3341370"/>
+            <wp:effectExtent l="0" t="0" r="0" b="0"/>
+            <wp:docPr id="1783638126" name="Picture 1"/>
+            <wp:cNvGraphicFramePr>
+              <a:graphicFrameLocks xmlns:a="http://schemas.openxmlformats.org/drawingml/2006/main" noChangeAspect="1"/>
+            </wp:cNvGraphicFramePr>
+            <a:graphic xmlns:a="http://schemas.openxmlformats.org/drawingml/2006/main">
+              <a:graphicData uri="http://schemas.openxmlformats.org/drawingml/2006/picture">
+                <pic:pic xmlns:pic="http://schemas.openxmlformats.org/drawingml/2006/picture">
+                  <pic:nvPicPr>
+                    <pic:cNvPr id="1783638126" name=""/>
+                    <pic:cNvPicPr/>
+                  </pic:nvPicPr>
+                  <pic:blipFill>
+                    <a:blip r:embed="rId10"/>
+                    <a:stretch>
+                      <a:fillRect/>
+                    </a:stretch>
+                  </pic:blipFill>
+                  <pic:spPr>
+                    <a:xfrm>
+                      <a:off x="0" y="0"/>
+                      <a:ext cx="5943600" cy="3341370"/>
+                    </a:xfrm>
+                    <a:prstGeom prst="rect">
+                      <a:avLst/>
+                    </a:prstGeom>
+                  </pic:spPr>
+                </pic:pic>
+              </a:graphicData>
+            </a:graphic>
+          </wp:inline>
+        </w:drawing>
+      </w:r>
+      <w:r>
+        <w:rPr>
+          <w:rFonts w:ascii="Futura" w:hAnsi="Futura"/>
+          <w:i/>
+          <w:iCs/>
+          <w:sz w:val="20"/>
+          <w:szCs w:val="20"/>
+        </w:rPr>
+        <w:br/>
+        <w:t>Biometrics page showing biometric devices</w:t>
+      </w:r>
+      <w:r>
+        <w:rPr>
+          <w:rFonts w:ascii="Futura" w:hAnsi="Futura"/>
+          <w:i/>
+          <w:iCs/>
+          <w:sz w:val="20"/>
+          <w:szCs w:val="20"/>
+        </w:rPr>
+        <w:lastRenderedPageBreak/>
+        <w:drawing>
+          <wp:inline distT="0" distB="0" distL="0" distR="0" wp14:anchorId="00F10470" wp14:editId="0E362F8D">
+            <wp:extent cx="5943600" cy="3341370"/>
+            <wp:effectExtent l="0" t="0" r="0" b="0"/>
+            <wp:docPr id="1777058041" name="Picture 1"/>
+            <wp:cNvGraphicFramePr>
+              <a:graphicFrameLocks xmlns:a="http://schemas.openxmlformats.org/drawingml/2006/main" noChangeAspect="1"/>
+            </wp:cNvGraphicFramePr>
+            <a:graphic xmlns:a="http://schemas.openxmlformats.org/drawingml/2006/main">
+              <a:graphicData uri="http://schemas.openxmlformats.org/drawingml/2006/picture">
+                <pic:pic xmlns:pic="http://schemas.openxmlformats.org/drawingml/2006/picture">
+                  <pic:nvPicPr>
+                    <pic:cNvPr id="1777058041" name=""/>
+                    <pic:cNvPicPr/>
+                  </pic:nvPicPr>
+                  <pic:blipFill>
+                    <a:blip r:embed="rId11"/>
+                    <a:stretch>
+                      <a:fillRect/>
+                    </a:stretch>
+                  </pic:blipFill>
+                  <pic:spPr>
+                    <a:xfrm>
+                      <a:off x="0" y="0"/>
+                      <a:ext cx="5943600" cy="3341370"/>
+                    </a:xfrm>
+                    <a:prstGeom prst="rect">
+                      <a:avLst/>
+                    </a:prstGeom>
+                  </pic:spPr>
+                </pic:pic>
+              </a:graphicData>
+            </a:graphic>
+          </wp:inline>
+        </w:drawing>
+      </w:r>
+      <w:r>
+        <w:rPr>
+          <w:rFonts w:ascii="Futura" w:hAnsi="Futura"/>
+          <w:i/>
+          <w:iCs/>
+          <w:sz w:val="20"/>
+          <w:szCs w:val="20"/>
+        </w:rPr>
+        <w:br/>
+        <w:t>Desktops Page presenting connected desktops</w:t>
+      </w:r>
+    </w:p>
+    <w:p>
+      <w:pPr>
+        <w:jc w:val="center"/>
+        <w:rPr>
+          <w:rFonts w:ascii="Futura" w:hAnsi="Futura"/>
+          <w:i/>
+          <w:iCs/>
+          <w:sz w:val="20"/>
+          <w:szCs w:val="20"/>
+        </w:rPr>
+      </w:pPr>
+    </w:p>
+    <w:p>
+      <w:pPr>
+        <w:jc w:val="center"/>
+        <w:rPr>
+          <w:rFonts w:ascii="Futura" w:hAnsi="Futura"/>
+          <w:i/>
+          <w:iCs/>
+          <w:sz w:val="20"/>
+          <w:szCs w:val="20"/>
+        </w:rPr>
+      </w:pPr>
+    </w:p>
+    <w:p>
+      <w:pPr>
+        <w:jc w:val="center"/>
+        <w:rPr>
+          <w:rFonts w:ascii="Futura" w:hAnsi="Futura"/>
+          <w:i/>
+          <w:iCs/>
+          <w:sz w:val="20"/>
+          <w:szCs w:val="20"/>
+        </w:rPr>
+      </w:pPr>
+    </w:p>
+    <w:p>
+      <w:pPr>
+        <w:jc w:val="center"/>
+        <w:rPr>
+          <w:rFonts w:ascii="Futura" w:hAnsi="Futura"/>
+          <w:i/>
+          <w:iCs/>
+          <w:sz w:val="20"/>
+          <w:szCs w:val="20"/>
+        </w:rPr>
+      </w:pPr>
+      <w:r>
+        <w:rPr>
+          <w:rFonts w:ascii="Futura" w:hAnsi="Futura"/>
+          <w:i/>
+          <w:iCs/>
+          <w:sz w:val="20"/>
+          <w:szCs w:val="20"/>
+        </w:rPr>
+        <w:drawing>
+          <wp:inline distT="0" distB="0" distL="0" distR="0" wp14:anchorId="0FB3AD04" wp14:editId="6BC3A139">
+            <wp:extent cx="5943600" cy="3341370"/>
+            <wp:effectExtent l="0" t="0" r="0" b="0"/>
+            <wp:docPr id="955504992" name="Picture 1"/>
+            <wp:cNvGraphicFramePr>
+              <a:graphicFrameLocks xmlns:a="http://schemas.openxmlformats.org/drawingml/2006/main" noChangeAspect="1"/>
+            </wp:cNvGraphicFramePr>
+            <a:graphic xmlns:a="http://schemas.openxmlformats.org/drawingml/2006/main">
+              <a:graphicData uri="http://schemas.openxmlformats.org/drawingml/2006/picture">
+                <pic:pic xmlns:pic="http://schemas.openxmlformats.org/drawingml/2006/picture">
+                  <pic:nvPicPr>
+                    <pic:cNvPr id="955504992" name=""/>
+                    <pic:cNvPicPr/>
+                  </pic:nvPicPr>
+                  <pic:blipFill>
+                    <a:blip r:embed="rId12"/>
+                    <a:stretch>
+                      <a:fillRect/>
+                    </a:stretch>
+                  </pic:blipFill>
+                  <pic:spPr>
+                    <a:xfrm>
+                      <a:off x="0" y="0"/>
+                      <a:ext cx="5943600" cy="3341370"/>
+                    </a:xfrm>
+                    <a:prstGeom prst="rect">
+                      <a:avLst/>
+                    </a:prstGeom>
+                  </pic:spPr>
+                </pic:pic>
+              </a:graphicData>
+            </a:graphic>
+          </wp:inline>
+        </w:drawing>
+      </w:r>
+      <w:r>
+        <w:rPr>
+          <w:rFonts w:ascii="Futura" w:hAnsi="Futura"/>
+          <w:i/>
+          <w:iCs/>
+          <w:sz w:val="20"/>
+          <w:szCs w:val="20"/>
+        </w:rPr>
+        <w:br/>
+        <w:t>Laptops page showing connected laptops</w:t>
+      </w:r>
+      <w:r>
+        <w:rPr>
+          <w:rFonts w:ascii="Futura" w:hAnsi="Futura"/>
+          <w:i/>
+          <w:iCs/>
+          <w:sz w:val="20"/>
+          <w:szCs w:val="20"/>
+        </w:rPr>
+        <w:lastRenderedPageBreak/>
+        <w:drawing>
+          <wp:inline distT="0" distB="0" distL="0" distR="0" wp14:anchorId="73F960AA" wp14:editId="263A9B1E">
+            <wp:extent cx="5943600" cy="3341370"/>
+            <wp:effectExtent l="0" t="0" r="0" b="0"/>
+            <wp:docPr id="2056471013" name="Picture 1"/>
+            <wp:cNvGraphicFramePr>
+              <a:graphicFrameLocks xmlns:a="http://schemas.openxmlformats.org/drawingml/2006/main" noChangeAspect="1"/>
+            </wp:cNvGraphicFramePr>
+            <a:graphic xmlns:a="http://schemas.openxmlformats.org/drawingml/2006/main">
+              <a:graphicData uri="http://schemas.openxmlformats.org/drawingml/2006/picture">
+                <pic:pic xmlns:pic="http://schemas.openxmlformats.org/drawingml/2006/picture">
+                  <pic:nvPicPr>
+                    <pic:cNvPr id="2056471013" name=""/>
+                    <pic:cNvPicPr/>
+                  </pic:nvPicPr>
+                  <pic:blipFill>
+                    <a:blip r:embed="rId13"/>
+                    <a:stretch>
+                      <a:fillRect/>
+                    </a:stretch>
+                  </pic:blipFill>
+                  <pic:spPr>
+                    <a:xfrm>
+                      <a:off x="0" y="0"/>
+                      <a:ext cx="5943600" cy="3341370"/>
+                    </a:xfrm>
+                    <a:prstGeom prst="rect">
+                      <a:avLst/>
+                    </a:prstGeom>
+                  </pic:spPr>
+                </pic:pic>
+              </a:graphicData>
+            </a:graphic>
+          </wp:inline>
+        </w:drawing>
+      </w:r>
+      <w:r>
+        <w:rPr>
+          <w:rFonts w:ascii="Futura" w:hAnsi="Futura"/>
+          <w:i/>
+          <w:iCs/>
+          <w:sz w:val="20"/>
+          <w:szCs w:val="20"/>
+        </w:rPr>
+        <w:br/>
+        <w:t>Compute Sticks page</w:t>
+      </w:r>
+    </w:p>
+    <w:p>
+      <w:pPr>
+        <w:jc w:val="center"/>
+        <w:rPr>
+          <w:rFonts w:ascii="Futura" w:hAnsi="Futura"/>
+          <w:i/>
+          <w:iCs/>
+          <w:sz w:val="20"/>
+          <w:szCs w:val="20"/>
+        </w:rPr>
+      </w:pPr>
+    </w:p>
+    <w:p>
+      <w:pPr>
         <w:numPr>
           <w:ilvl w:val="0"/>
           <w:numId w:val="4"/>
         </w:numPr>
-        <w:jc w:val="both"/>
         <w:rPr>
           <w:rFonts w:ascii="Futura" w:hAnsi="Futura"/>
         </w:rPr>
@@ -1270,20 +2071,184 @@
         </w:rPr>
         <w:t xml:space="preserve"> (</w:t>
       </w:r>
-      <w:proofErr w:type="spellStart"/>
-      <w:r>
-        <w:rPr>
-          <w:rFonts w:ascii="Futura" w:hAnsi="Futura"/>
-        </w:rPr>
-        <w:t>editAddresses.php</w:t>
-      </w:r>
-      <w:proofErr w:type="spellEnd"/>
+      <w:r>
+        <w:rPr>
+          <w:rFonts w:ascii="Futura" w:hAnsi="Futura"/>
+        </w:rPr>
+        <w:t>click the hamburger menu on the bottom side of the navigation panel</w:t>
+      </w:r>
       <w:r>
         <w:rPr>
           <w:rFonts w:ascii="Futura" w:hAnsi="Futura"/>
         </w:rPr>
         <w:t>) page to modify the list of monitored hardware. The system reads from and writes to local .txt configuration files to keep the monitoring targets dynamic.</w:t>
       </w:r>
+    </w:p>
+    <w:p>
+      <w:pPr>
+        <w:jc w:val="center"/>
+        <w:rPr>
+          <w:rFonts w:ascii="Futura" w:hAnsi="Futura"/>
+          <w:i/>
+          <w:iCs/>
+          <w:sz w:val="20"/>
+          <w:szCs w:val="20"/>
+        </w:rPr>
+      </w:pPr>
+      <w:r>
+        <w:rPr>
+          <w:rFonts w:ascii="Futura" w:hAnsi="Futura"/>
+        </w:rPr>
+        <w:drawing>
+          <wp:inline distT="0" distB="0" distL="0" distR="0" wp14:anchorId="6A55E091" wp14:editId="40F226CE">
+            <wp:extent cx="5943600" cy="3341370"/>
+            <wp:effectExtent l="0" t="0" r="0" b="0"/>
+            <wp:docPr id="1507368401" name="Picture 1"/>
+            <wp:cNvGraphicFramePr>
+              <a:graphicFrameLocks xmlns:a="http://schemas.openxmlformats.org/drawingml/2006/main" noChangeAspect="1"/>
+            </wp:cNvGraphicFramePr>
+            <a:graphic xmlns:a="http://schemas.openxmlformats.org/drawingml/2006/main">
+              <a:graphicData uri="http://schemas.openxmlformats.org/drawingml/2006/picture">
+                <pic:pic xmlns:pic="http://schemas.openxmlformats.org/drawingml/2006/picture">
+                  <pic:nvPicPr>
+                    <pic:cNvPr id="1507368401" name=""/>
+                    <pic:cNvPicPr/>
+                  </pic:nvPicPr>
+                  <pic:blipFill>
+                    <a:blip r:embed="rId14"/>
+                    <a:stretch>
+                      <a:fillRect/>
+                    </a:stretch>
+                  </pic:blipFill>
+                  <pic:spPr>
+                    <a:xfrm>
+                      <a:off x="0" y="0"/>
+                      <a:ext cx="5943600" cy="3341370"/>
+                    </a:xfrm>
+                    <a:prstGeom prst="rect">
+                      <a:avLst/>
+                    </a:prstGeom>
+                  </pic:spPr>
+                </pic:pic>
+              </a:graphicData>
+            </a:graphic>
+          </wp:inline>
+        </w:drawing>
+      </w:r>
+      <w:r>
+        <w:rPr>
+          <w:rFonts w:ascii="Futura" w:hAnsi="Futura"/>
+        </w:rPr>
+        <w:br/>
+      </w:r>
+      <w:r>
+        <w:rPr>
+          <w:rFonts w:ascii="Futura" w:hAnsi="Futura"/>
+          <w:i/>
+          <w:iCs/>
+          <w:sz w:val="20"/>
+          <w:szCs w:val="20"/>
+        </w:rPr>
+        <w:t xml:space="preserve">IP Address </w:t>
+      </w:r>
+      <w:r>
+        <w:rPr>
+          <w:rFonts w:ascii="Futura" w:hAnsi="Futura"/>
+          <w:i/>
+          <w:iCs/>
+          <w:sz w:val="20"/>
+          <w:szCs w:val="20"/>
+        </w:rPr>
+        <w:t>Network</w:t>
+      </w:r>
+      <w:r>
+        <w:rPr>
+          <w:rFonts w:ascii="Futura" w:hAnsi="Futura"/>
+          <w:i/>
+          <w:iCs/>
+          <w:sz w:val="20"/>
+          <w:szCs w:val="20"/>
+        </w:rPr>
+        <w:t xml:space="preserve"> </w:t>
+      </w:r>
+      <w:r>
+        <w:rPr>
+          <w:rFonts w:ascii="Futura" w:hAnsi="Futura"/>
+          <w:i/>
+          <w:iCs/>
+          <w:sz w:val="20"/>
+          <w:szCs w:val="20"/>
+        </w:rPr>
+        <w:t>Editor page</w:t>
+      </w:r>
+    </w:p>
+    <w:p>
+      <w:pPr>
+        <w:jc w:val="center"/>
+        <w:rPr>
+          <w:rFonts w:ascii="Futura" w:hAnsi="Futura"/>
+          <w:i/>
+          <w:iCs/>
+          <w:sz w:val="20"/>
+          <w:szCs w:val="20"/>
+        </w:rPr>
+      </w:pPr>
+    </w:p>
+    <w:p>
+      <w:pPr>
+        <w:jc w:val="center"/>
+        <w:rPr>
+          <w:rFonts w:ascii="Futura" w:hAnsi="Futura"/>
+          <w:i/>
+          <w:iCs/>
+          <w:sz w:val="20"/>
+          <w:szCs w:val="20"/>
+        </w:rPr>
+      </w:pPr>
+    </w:p>
+    <w:p>
+      <w:pPr>
+        <w:jc w:val="center"/>
+        <w:rPr>
+          <w:rFonts w:ascii="Futura" w:hAnsi="Futura"/>
+          <w:i/>
+          <w:iCs/>
+          <w:sz w:val="20"/>
+          <w:szCs w:val="20"/>
+        </w:rPr>
+      </w:pPr>
+    </w:p>
+    <w:p>
+      <w:pPr>
+        <w:jc w:val="center"/>
+        <w:rPr>
+          <w:rFonts w:ascii="Futura" w:hAnsi="Futura"/>
+          <w:i/>
+          <w:iCs/>
+          <w:sz w:val="20"/>
+          <w:szCs w:val="20"/>
+        </w:rPr>
+      </w:pPr>
+    </w:p>
+    <w:p>
+      <w:pPr>
+        <w:jc w:val="center"/>
+        <w:rPr>
+          <w:rFonts w:ascii="Futura" w:hAnsi="Futura"/>
+          <w:i/>
+          <w:iCs/>
+          <w:sz w:val="20"/>
+          <w:szCs w:val="20"/>
+        </w:rPr>
+      </w:pPr>
+    </w:p>
+    <w:p>
+      <w:pPr>
+        <w:jc w:val="both"/>
+        <w:rPr>
+          <w:rFonts w:ascii="Futura" w:hAnsi="Futura"/>
+        </w:rPr>
+      </w:pPr>
     </w:p>
     <w:p>
       <w:pPr>
@@ -1302,6 +2267,7 @@
           <w:b/>
           <w:bCs/>
         </w:rPr>
+        <w:lastRenderedPageBreak/>
         <w:t>Log Auditing:</w:t>
       </w:r>
       <w:r>
@@ -1310,56 +2276,118 @@
         </w:rPr>
         <w:t xml:space="preserve"> Use </w:t>
       </w:r>
-      <w:proofErr w:type="spellStart"/>
-      <w:r>
-        <w:rPr>
-          <w:rFonts w:ascii="Futura" w:hAnsi="Futura"/>
-        </w:rPr>
-        <w:t>logManager.php</w:t>
-      </w:r>
-      <w:proofErr w:type="spellEnd"/>
-      <w:r>
-        <w:rPr>
-          <w:rFonts w:ascii="Futura" w:hAnsi="Futura"/>
-        </w:rPr>
-        <w:t xml:space="preserve"> to view historical connectivity logs to identify patterns in network downtime.</w:t>
-      </w:r>
-    </w:p>
-    <w:p>
-      <w:pPr>
-        <w:jc w:val="both"/>
-        <w:rPr>
-          <w:rFonts w:ascii="Futura" w:hAnsi="Futura"/>
-        </w:rPr>
-      </w:pPr>
-      <w:r>
-        <w:rPr>
-          <w:rFonts w:ascii="Futura" w:hAnsi="Futura"/>
-        </w:rPr>
-        <w:pict w14:anchorId="657C3E43">
-          <v:rect id="_x0000_i1030" style="width:0;height:1.5pt" o:hralign="center" o:hrstd="t" o:hr="t" fillcolor="#a0a0a0" stroked="f"/>
-        </w:pict>
-      </w:r>
-    </w:p>
-    <w:p>
-      <w:pPr>
-        <w:jc w:val="both"/>
-        <w:rPr>
-          <w:rFonts w:ascii="Futura" w:hAnsi="Futura"/>
-          <w:b/>
-          <w:bCs/>
-        </w:rPr>
-      </w:pPr>
-    </w:p>
-    <w:p>
-      <w:pPr>
-        <w:jc w:val="both"/>
-        <w:rPr>
-          <w:rFonts w:ascii="Futura" w:hAnsi="Futura"/>
-          <w:b/>
-          <w:bCs/>
-        </w:rPr>
-      </w:pPr>
+      <w:r>
+        <w:rPr>
+          <w:rFonts w:ascii="Futura" w:hAnsi="Futura"/>
+          <w:b/>
+          <w:bCs/>
+        </w:rPr>
+        <w:t xml:space="preserve">Download Logs </w:t>
+      </w:r>
+      <w:r>
+        <w:rPr>
+          <w:rFonts w:ascii="Futura" w:hAnsi="Futura"/>
+        </w:rPr>
+        <w:t>(</w:t>
+      </w:r>
+      <w:r>
+        <w:rPr>
+          <w:rFonts w:ascii="Futura" w:hAnsi="Futura"/>
+        </w:rPr>
+        <w:t>click the hamburger menu on the bottom side of the navigation panel</w:t>
+      </w:r>
+      <w:r>
+        <w:rPr>
+          <w:rFonts w:ascii="Futura" w:hAnsi="Futura"/>
+        </w:rPr>
+        <w:t>)</w:t>
+      </w:r>
+      <w:r>
+        <w:rPr>
+          <w:rFonts w:ascii="Futura" w:hAnsi="Futura"/>
+        </w:rPr>
+        <w:t xml:space="preserve"> to </w:t>
+      </w:r>
+      <w:r>
+        <w:rPr>
+          <w:rFonts w:ascii="Futura" w:hAnsi="Futura"/>
+        </w:rPr>
+        <w:t>download and view</w:t>
+      </w:r>
+      <w:r>
+        <w:rPr>
+          <w:rFonts w:ascii="Futura" w:hAnsi="Futura"/>
+        </w:rPr>
+        <w:t xml:space="preserve"> historical connectivity logs to identify patterns in network downtime.</w:t>
+      </w:r>
+    </w:p>
+    <w:p>
+      <w:pPr>
+        <w:jc w:val="center"/>
+        <w:rPr>
+          <w:rFonts w:ascii="Futura" w:hAnsi="Futura"/>
+          <w:b/>
+          <w:bCs/>
+        </w:rPr>
+      </w:pPr>
+      <w:r>
+        <w:rPr>
+          <w:rFonts w:ascii="Futura" w:hAnsi="Futura"/>
+          <w:b/>
+          <w:bCs/>
+        </w:rPr>
+        <w:drawing>
+          <wp:inline distT="0" distB="0" distL="0" distR="0" wp14:anchorId="03CF114A" wp14:editId="0857D6A3">
+            <wp:extent cx="5943600" cy="3341370"/>
+            <wp:effectExtent l="0" t="0" r="0" b="0"/>
+            <wp:docPr id="1405345736" name="Picture 1"/>
+            <wp:cNvGraphicFramePr>
+              <a:graphicFrameLocks xmlns:a="http://schemas.openxmlformats.org/drawingml/2006/main" noChangeAspect="1"/>
+            </wp:cNvGraphicFramePr>
+            <a:graphic xmlns:a="http://schemas.openxmlformats.org/drawingml/2006/main">
+              <a:graphicData uri="http://schemas.openxmlformats.org/drawingml/2006/picture">
+                <pic:pic xmlns:pic="http://schemas.openxmlformats.org/drawingml/2006/picture">
+                  <pic:nvPicPr>
+                    <pic:cNvPr id="1405345736" name=""/>
+                    <pic:cNvPicPr/>
+                  </pic:nvPicPr>
+                  <pic:blipFill>
+                    <a:blip r:embed="rId15"/>
+                    <a:stretch>
+                      <a:fillRect/>
+                    </a:stretch>
+                  </pic:blipFill>
+                  <pic:spPr>
+                    <a:xfrm>
+                      <a:off x="0" y="0"/>
+                      <a:ext cx="5943600" cy="3341370"/>
+                    </a:xfrm>
+                    <a:prstGeom prst="rect">
+                      <a:avLst/>
+                    </a:prstGeom>
+                  </pic:spPr>
+                </pic:pic>
+              </a:graphicData>
+            </a:graphic>
+          </wp:inline>
+        </w:drawing>
+      </w:r>
+      <w:r>
+        <w:rPr>
+          <w:rFonts w:ascii="Futura" w:hAnsi="Futura"/>
+        </w:rPr>
+        <w:br/>
+      </w:r>
+      <w:r>
+        <w:rPr>
+          <w:rFonts w:ascii="Futura" w:hAnsi="Futura"/>
+          <w:i/>
+          <w:iCs/>
+          <w:sz w:val="20"/>
+          <w:szCs w:val="20"/>
+        </w:rPr>
+        <w:t>Daily logs download page</w:t>
+      </w:r>
     </w:p>
     <w:p>
       <w:pPr>
@@ -1376,7 +2404,6 @@
         <w:rPr>
           <w:rFonts w:ascii="Futura" w:hAnsi="Futura"/>
         </w:rPr>
-        <w:lastRenderedPageBreak/>
         <w:pict w14:anchorId="5536555E">
           <v:rect id="_x0000_i1031" style="width:0;height:1.5pt" o:hralign="center" o:hrstd="t" o:hr="t" fillcolor="#a0a0a0" stroked="f"/>
         </w:pict>
@@ -1434,19 +2461,136 @@
     </w:p>
     <w:p>
       <w:pPr>
-        <w:jc w:val="both"/>
-        <w:rPr>
-          <w:rFonts w:ascii="Futura" w:hAnsi="Futura"/>
-          <w:b/>
-          <w:bCs/>
-        </w:rPr>
-      </w:pPr>
-      <w:r>
-        <w:rPr>
-          <w:rFonts w:ascii="Futura" w:hAnsi="Futura"/>
-          <w:b/>
-          <w:bCs/>
-        </w:rPr>
+        <w:jc w:val="center"/>
+        <w:rPr>
+          <w:rFonts w:ascii="Futura" w:hAnsi="Futura"/>
+          <w:i/>
+          <w:iCs/>
+          <w:sz w:val="20"/>
+          <w:szCs w:val="20"/>
+        </w:rPr>
+      </w:pPr>
+      <w:r>
+        <w:rPr>
+          <w:rFonts w:ascii="Futura" w:hAnsi="Futura"/>
+        </w:rPr>
+        <w:drawing>
+          <wp:inline distT="0" distB="0" distL="0" distR="0" wp14:anchorId="51182770" wp14:editId="6D91E55F">
+            <wp:extent cx="5943600" cy="3341370"/>
+            <wp:effectExtent l="0" t="0" r="0" b="0"/>
+            <wp:docPr id="1779310926" name="Picture 1"/>
+            <wp:cNvGraphicFramePr>
+              <a:graphicFrameLocks xmlns:a="http://schemas.openxmlformats.org/drawingml/2006/main" noChangeAspect="1"/>
+            </wp:cNvGraphicFramePr>
+            <a:graphic xmlns:a="http://schemas.openxmlformats.org/drawingml/2006/main">
+              <a:graphicData uri="http://schemas.openxmlformats.org/drawingml/2006/picture">
+                <pic:pic xmlns:pic="http://schemas.openxmlformats.org/drawingml/2006/picture">
+                  <pic:nvPicPr>
+                    <pic:cNvPr id="1779310926" name=""/>
+                    <pic:cNvPicPr/>
+                  </pic:nvPicPr>
+                  <pic:blipFill>
+                    <a:blip r:embed="rId16"/>
+                    <a:stretch>
+                      <a:fillRect/>
+                    </a:stretch>
+                  </pic:blipFill>
+                  <pic:spPr>
+                    <a:xfrm>
+                      <a:off x="0" y="0"/>
+                      <a:ext cx="5943600" cy="3341370"/>
+                    </a:xfrm>
+                    <a:prstGeom prst="rect">
+                      <a:avLst/>
+                    </a:prstGeom>
+                  </pic:spPr>
+                </pic:pic>
+              </a:graphicData>
+            </a:graphic>
+          </wp:inline>
+        </w:drawing>
+      </w:r>
+      <w:r>
+        <w:rPr>
+          <w:rFonts w:ascii="Futura" w:hAnsi="Futura"/>
+        </w:rPr>
+        <w:br/>
+      </w:r>
+      <w:r>
+        <w:rPr>
+          <w:rFonts w:ascii="Futura" w:hAnsi="Futura"/>
+          <w:i/>
+          <w:iCs/>
+          <w:sz w:val="20"/>
+          <w:szCs w:val="20"/>
+        </w:rPr>
+        <w:t>System Alert when host is offline</w:t>
+      </w:r>
+    </w:p>
+    <w:p>
+      <w:pPr>
+        <w:jc w:val="center"/>
+        <w:rPr>
+          <w:rFonts w:ascii="Futura" w:hAnsi="Futura"/>
+          <w:i/>
+          <w:iCs/>
+          <w:sz w:val="20"/>
+          <w:szCs w:val="20"/>
+        </w:rPr>
+      </w:pPr>
+    </w:p>
+    <w:p>
+      <w:pPr>
+        <w:jc w:val="center"/>
+        <w:rPr>
+          <w:rFonts w:ascii="Futura" w:hAnsi="Futura"/>
+          <w:i/>
+          <w:iCs/>
+          <w:sz w:val="20"/>
+          <w:szCs w:val="20"/>
+        </w:rPr>
+      </w:pPr>
+    </w:p>
+    <w:p>
+      <w:pPr>
+        <w:jc w:val="center"/>
+        <w:rPr>
+          <w:rFonts w:ascii="Futura" w:hAnsi="Futura"/>
+          <w:i/>
+          <w:iCs/>
+          <w:sz w:val="20"/>
+          <w:szCs w:val="20"/>
+        </w:rPr>
+      </w:pPr>
+    </w:p>
+    <w:p>
+      <w:pPr>
+        <w:jc w:val="center"/>
+        <w:rPr>
+          <w:rFonts w:ascii="Futura" w:hAnsi="Futura"/>
+          <w:i/>
+          <w:iCs/>
+          <w:sz w:val="20"/>
+          <w:szCs w:val="20"/>
+        </w:rPr>
+      </w:pPr>
+    </w:p>
+    <w:p>
+      <w:pPr>
+        <w:jc w:val="both"/>
+        <w:rPr>
+          <w:rFonts w:ascii="Futura" w:hAnsi="Futura"/>
+          <w:b/>
+          <w:bCs/>
+        </w:rPr>
+      </w:pPr>
+      <w:r>
+        <w:rPr>
+          <w:rFonts w:ascii="Futura" w:hAnsi="Futura"/>
+          <w:b/>
+          <w:bCs/>
+        </w:rPr>
+        <w:lastRenderedPageBreak/>
         <w:t>If the Alert Triggers:</w:t>
       </w:r>
     </w:p>
@@ -1567,6 +2711,116 @@
           <w:rFonts w:ascii="Futura" w:hAnsi="Futura"/>
         </w:rPr>
       </w:pPr>
+    </w:p>
+    <w:p>
+      <w:pPr>
+        <w:jc w:val="both"/>
+        <w:rPr>
+          <w:rFonts w:ascii="Futura" w:hAnsi="Futura"/>
+        </w:rPr>
+      </w:pPr>
+      <w:r>
+        <w:rPr>
+          <w:rFonts w:ascii="Futura" w:hAnsi="Futura"/>
+        </w:rPr>
+        <w:t xml:space="preserve">The system also plays a short two-beep alarm when an </w:t>
+      </w:r>
+      <w:proofErr w:type="spellStart"/>
+      <w:r>
+        <w:rPr>
+          <w:rFonts w:ascii="Futura" w:hAnsi="Futura"/>
+        </w:rPr>
+        <w:t>ip</w:t>
+      </w:r>
+      <w:proofErr w:type="spellEnd"/>
+      <w:r>
+        <w:rPr>
+          <w:rFonts w:ascii="Futura" w:hAnsi="Futura"/>
+        </w:rPr>
+        <w:t xml:space="preserve"> returned as timed out for the first time or network status changed from online to offline.</w:t>
+      </w:r>
+      <w:r>
+        <w:rPr>
+          <w:rFonts w:ascii="Futura" w:hAnsi="Futura"/>
+        </w:rPr>
+        <w:t xml:space="preserve"> Number of offline devices is represented by a number badge</w:t>
+      </w:r>
+    </w:p>
+    <w:p>
+      <w:pPr>
+        <w:jc w:val="center"/>
+        <w:rPr>
+          <w:rFonts w:ascii="Futura" w:hAnsi="Futura"/>
+          <w:i/>
+          <w:iCs/>
+          <w:sz w:val="20"/>
+          <w:szCs w:val="20"/>
+        </w:rPr>
+      </w:pPr>
+      <w:r>
+        <w:rPr>
+          <w:rFonts w:ascii="Futura" w:hAnsi="Futura"/>
+        </w:rPr>
+        <w:drawing>
+          <wp:inline distT="0" distB="0" distL="0" distR="0" wp14:anchorId="38E7BDFC" wp14:editId="257059F5">
+            <wp:extent cx="5943600" cy="3341370"/>
+            <wp:effectExtent l="0" t="0" r="0" b="0"/>
+            <wp:docPr id="1021497895" name="Picture 1"/>
+            <wp:cNvGraphicFramePr>
+              <a:graphicFrameLocks xmlns:a="http://schemas.openxmlformats.org/drawingml/2006/main" noChangeAspect="1"/>
+            </wp:cNvGraphicFramePr>
+            <a:graphic xmlns:a="http://schemas.openxmlformats.org/drawingml/2006/main">
+              <a:graphicData uri="http://schemas.openxmlformats.org/drawingml/2006/picture">
+                <pic:pic xmlns:pic="http://schemas.openxmlformats.org/drawingml/2006/picture">
+                  <pic:nvPicPr>
+                    <pic:cNvPr id="1021497895" name=""/>
+                    <pic:cNvPicPr/>
+                  </pic:nvPicPr>
+                  <pic:blipFill>
+                    <a:blip r:embed="rId17"/>
+                    <a:stretch>
+                      <a:fillRect/>
+                    </a:stretch>
+                  </pic:blipFill>
+                  <pic:spPr>
+                    <a:xfrm>
+                      <a:off x="0" y="0"/>
+                      <a:ext cx="5943600" cy="3341370"/>
+                    </a:xfrm>
+                    <a:prstGeom prst="rect">
+                      <a:avLst/>
+                    </a:prstGeom>
+                  </pic:spPr>
+                </pic:pic>
+              </a:graphicData>
+            </a:graphic>
+          </wp:inline>
+        </w:drawing>
+      </w:r>
+      <w:r>
+        <w:rPr>
+          <w:rFonts w:ascii="Futura" w:hAnsi="Futura"/>
+        </w:rPr>
+        <w:br/>
+      </w:r>
+      <w:r>
+        <w:rPr>
+          <w:rFonts w:ascii="Futura" w:hAnsi="Futura"/>
+          <w:i/>
+          <w:iCs/>
+          <w:sz w:val="20"/>
+          <w:szCs w:val="20"/>
+        </w:rPr>
+        <w:t>Navigation bar with number badges</w:t>
+      </w:r>
+    </w:p>
+    <w:p>
+      <w:pPr>
+        <w:jc w:val="both"/>
+        <w:rPr>
+          <w:rFonts w:ascii="Futura" w:hAnsi="Futura"/>
+        </w:rPr>
+      </w:pPr>
       <w:r>
         <w:rPr>
           <w:rFonts w:ascii="Futura" w:hAnsi="Futura"/>
@@ -1712,8 +2966,8 @@
       </w:pPr>
     </w:p>
     <w:sectPr>
-      <w:headerReference w:type="default" r:id="rId7"/>
-      <w:pgSz w:w="12240" w:h="15840"/>
+      <w:headerReference w:type="default" r:id="rId18"/>
+      <w:pgSz w:w="12240" w:h="20160" w:code="5"/>
       <w:pgMar w:top="1440" w:right="1440" w:bottom="1440" w:left="1440" w:header="720" w:footer="720" w:gutter="0"/>
       <w:cols w:space="720"/>
       <w:docGrid w:linePitch="360"/>
@@ -2521,6 +3775,119 @@
     </w:lvl>
   </w:abstractNum>
   <w:abstractNum w:abstractNumId="5" w15:restartNumberingAfterBreak="0">
+    <w:nsid w:val="6AE8182B"/>
+    <w:multiLevelType w:val="hybridMultilevel"/>
+    <w:tmpl w:val="BDE21FAE"/>
+    <w:lvl w:ilvl="0" w:tplc="04090001">
+      <w:start w:val="1"/>
+      <w:numFmt w:val="bullet"/>
+      <w:lvlText w:val=""/>
+      <w:lvlJc w:val="left"/>
+      <w:pPr>
+        <w:ind w:left="720" w:hanging="360"/>
+      </w:pPr>
+      <w:rPr>
+        <w:rFonts w:ascii="Symbol" w:hAnsi="Symbol" w:hint="default"/>
+      </w:rPr>
+    </w:lvl>
+    <w:lvl w:ilvl="1" w:tplc="04090003" w:tentative="1">
+      <w:start w:val="1"/>
+      <w:numFmt w:val="bullet"/>
+      <w:lvlText w:val="o"/>
+      <w:lvlJc w:val="left"/>
+      <w:pPr>
+        <w:ind w:left="1440" w:hanging="360"/>
+      </w:pPr>
+      <w:rPr>
+        <w:rFonts w:ascii="Courier New" w:hAnsi="Courier New" w:cs="Courier New" w:hint="default"/>
+      </w:rPr>
+    </w:lvl>
+    <w:lvl w:ilvl="2" w:tplc="04090005" w:tentative="1">
+      <w:start w:val="1"/>
+      <w:numFmt w:val="bullet"/>
+      <w:lvlText w:val=""/>
+      <w:lvlJc w:val="left"/>
+      <w:pPr>
+        <w:ind w:left="2160" w:hanging="360"/>
+      </w:pPr>
+      <w:rPr>
+        <w:rFonts w:ascii="Wingdings" w:hAnsi="Wingdings" w:hint="default"/>
+      </w:rPr>
+    </w:lvl>
+    <w:lvl w:ilvl="3" w:tplc="04090001" w:tentative="1">
+      <w:start w:val="1"/>
+      <w:numFmt w:val="bullet"/>
+      <w:lvlText w:val=""/>
+      <w:lvlJc w:val="left"/>
+      <w:pPr>
+        <w:ind w:left="2880" w:hanging="360"/>
+      </w:pPr>
+      <w:rPr>
+        <w:rFonts w:ascii="Symbol" w:hAnsi="Symbol" w:hint="default"/>
+      </w:rPr>
+    </w:lvl>
+    <w:lvl w:ilvl="4" w:tplc="04090003" w:tentative="1">
+      <w:start w:val="1"/>
+      <w:numFmt w:val="bullet"/>
+      <w:lvlText w:val="o"/>
+      <w:lvlJc w:val="left"/>
+      <w:pPr>
+        <w:ind w:left="3600" w:hanging="360"/>
+      </w:pPr>
+      <w:rPr>
+        <w:rFonts w:ascii="Courier New" w:hAnsi="Courier New" w:cs="Courier New" w:hint="default"/>
+      </w:rPr>
+    </w:lvl>
+    <w:lvl w:ilvl="5" w:tplc="04090005" w:tentative="1">
+      <w:start w:val="1"/>
+      <w:numFmt w:val="bullet"/>
+      <w:lvlText w:val=""/>
+      <w:lvlJc w:val="left"/>
+      <w:pPr>
+        <w:ind w:left="4320" w:hanging="360"/>
+      </w:pPr>
+      <w:rPr>
+        <w:rFonts w:ascii="Wingdings" w:hAnsi="Wingdings" w:hint="default"/>
+      </w:rPr>
+    </w:lvl>
+    <w:lvl w:ilvl="6" w:tplc="04090001" w:tentative="1">
+      <w:start w:val="1"/>
+      <w:numFmt w:val="bullet"/>
+      <w:lvlText w:val=""/>
+      <w:lvlJc w:val="left"/>
+      <w:pPr>
+        <w:ind w:left="5040" w:hanging="360"/>
+      </w:pPr>
+      <w:rPr>
+        <w:rFonts w:ascii="Symbol" w:hAnsi="Symbol" w:hint="default"/>
+      </w:rPr>
+    </w:lvl>
+    <w:lvl w:ilvl="7" w:tplc="04090003" w:tentative="1">
+      <w:start w:val="1"/>
+      <w:numFmt w:val="bullet"/>
+      <w:lvlText w:val="o"/>
+      <w:lvlJc w:val="left"/>
+      <w:pPr>
+        <w:ind w:left="5760" w:hanging="360"/>
+      </w:pPr>
+      <w:rPr>
+        <w:rFonts w:ascii="Courier New" w:hAnsi="Courier New" w:cs="Courier New" w:hint="default"/>
+      </w:rPr>
+    </w:lvl>
+    <w:lvl w:ilvl="8" w:tplc="04090005" w:tentative="1">
+      <w:start w:val="1"/>
+      <w:numFmt w:val="bullet"/>
+      <w:lvlText w:val=""/>
+      <w:lvlJc w:val="left"/>
+      <w:pPr>
+        <w:ind w:left="6480" w:hanging="360"/>
+      </w:pPr>
+      <w:rPr>
+        <w:rFonts w:ascii="Wingdings" w:hAnsi="Wingdings" w:hint="default"/>
+      </w:rPr>
+    </w:lvl>
+  </w:abstractNum>
+  <w:abstractNum w:abstractNumId="6" w15:restartNumberingAfterBreak="0">
     <w:nsid w:val="78302849"/>
     <w:multiLevelType w:val="multilevel"/>
     <w:tmpl w:val="4EBAACB6"/>
@@ -2673,7 +4040,7 @@
     <w:abstractNumId w:val="2"/>
   </w:num>
   <w:num w:numId="2" w16cid:durableId="920288890">
-    <w:abstractNumId w:val="5"/>
+    <w:abstractNumId w:val="6"/>
   </w:num>
   <w:num w:numId="3" w16cid:durableId="1691292816">
     <w:abstractNumId w:val="4"/>
@@ -2686,6 +4053,9 @@
   </w:num>
   <w:num w:numId="6" w16cid:durableId="409696623">
     <w:abstractNumId w:val="3"/>
+  </w:num>
+  <w:num w:numId="7" w16cid:durableId="478230503">
+    <w:abstractNumId w:val="5"/>
   </w:num>
 </w:numbering>
 </file>

</xml_diff>